<commit_message>
Remove page-break-before from all Heading 1 styles in UserGuide
Each H1 section was forcing a new page; removed so the document flows continuously.

Co-Authored-By: Claude Sonnet 4.6 <noreply@anthropic.com>
</commit_message>
<xml_diff>
--- a/docs/UserGuide.docx
+++ b/docs/UserGuide.docx
@@ -108,7 +108,6 @@
     <w:p>
       <w:pPr>
         <w:pStyle w:val="Heading1"/>
-        <w:pageBreakBefore/>
         <w:spacing w:after="120" w:before="360"/>
       </w:pPr>
       <w:r>
@@ -413,7 +412,6 @@
     <w:p>
       <w:pPr>
         <w:pStyle w:val="Heading1"/>
-        <w:pageBreakBefore/>
         <w:spacing w:after="120" w:before="360"/>
       </w:pPr>
       <w:r>
@@ -601,7 +599,6 @@
     <w:p>
       <w:pPr>
         <w:pStyle w:val="Heading1"/>
-        <w:pageBreakBefore/>
         <w:spacing w:after="120" w:before="360"/>
       </w:pPr>
       <w:r>
@@ -766,7 +763,6 @@
     <w:p>
       <w:pPr>
         <w:pStyle w:val="Heading1"/>
-        <w:pageBreakBefore/>
         <w:spacing w:after="120" w:before="360"/>
       </w:pPr>
       <w:r>
@@ -820,7 +816,6 @@
     <w:p>
       <w:pPr>
         <w:pStyle w:val="Heading1"/>
-        <w:pageBreakBefore/>
         <w:spacing w:after="120" w:before="360"/>
       </w:pPr>
       <w:r>
@@ -1614,7 +1609,6 @@
     <w:p>
       <w:pPr>
         <w:pStyle w:val="Heading1"/>
-        <w:pageBreakBefore/>
         <w:spacing w:after="120" w:before="360"/>
       </w:pPr>
       <w:r>
@@ -2161,7 +2155,6 @@
     <w:p>
       <w:pPr>
         <w:pStyle w:val="Heading1"/>
-        <w:pageBreakBefore/>
         <w:spacing w:after="120" w:before="360"/>
       </w:pPr>
       <w:r>
@@ -2850,7 +2843,6 @@
     <w:p>
       <w:pPr>
         <w:pStyle w:val="Heading1"/>
-        <w:pageBreakBefore/>
         <w:spacing w:after="120" w:before="360"/>
       </w:pPr>
       <w:r>
@@ -3141,7 +3133,6 @@
     <w:p>
       <w:pPr>
         <w:pStyle w:val="Heading1"/>
-        <w:pageBreakBefore/>
         <w:spacing w:after="120" w:before="360"/>
       </w:pPr>
       <w:r>
@@ -3340,7 +3331,6 @@
     <w:p>
       <w:pPr>
         <w:pStyle w:val="Heading1"/>
-        <w:pageBreakBefore/>
         <w:spacing w:after="120" w:before="360"/>
       </w:pPr>
       <w:r>
@@ -3811,7 +3801,6 @@
     <w:p>
       <w:pPr>
         <w:pStyle w:val="Heading1"/>
-        <w:pageBreakBefore/>
         <w:spacing w:after="120" w:before="360"/>
       </w:pPr>
       <w:r>
@@ -4140,7 +4129,6 @@
     <w:p>
       <w:pPr>
         <w:pStyle w:val="Heading1"/>
-        <w:pageBreakBefore/>
         <w:spacing w:after="120" w:before="360"/>
       </w:pPr>
       <w:r>

</xml_diff>

<commit_message>
Add all screenshots to UserGuide.docx and UserGuide.md
Inserted all 10 screenshots (01_home through 09_settings, plus 04b_report_export)
into correct locations in both the Word document and the Markdown guide.
Also added the missing 04b_report_export step and screenshot to UserGuide.md.

Co-Authored-By: Claude Sonnet 4.6 <noreply@anthropic.com>
</commit_message>
<xml_diff>
--- a/docs/UserGuide.docx
+++ b/docs/UserGuide.docx
@@ -58,51 +58,6 @@
           <w:szCs w:val="24"/>
         </w:rPr>
         <w:t xml:space="preserve">Applies to: SharePoint Online</w:t>
-      </w:r>
-    </w:p>
-    <w:p>
-      <w:pPr>
-        <w:spacing w:after="120" w:before="80"/>
-      </w:pPr>
-      <w:r>
-        <w:drawing>
-          <wp:inline distT="0" distB="0" distL="0" distR="0">
-            <wp:extent cx="5524500" cy="3219450"/>
-            <wp:effectExtent t="0" r="0" b="0" l="0"/>
-            <wp:docPr id="1" name="" descr="" title=""/>
-            <wp:cNvGraphicFramePr>
-              <a:graphicFrameLocks xmlns:a="http://schemas.openxmlformats.org/drawingml/2006/main" noChangeAspect="1"/>
-            </wp:cNvGraphicFramePr>
-            <a:graphic xmlns:a="http://schemas.openxmlformats.org/drawingml/2006/main">
-              <a:graphicData uri="http://schemas.openxmlformats.org/drawingml/2006/picture">
-                <pic:pic xmlns:pic="http://schemas.openxmlformats.org/drawingml/2006/picture">
-                  <pic:nvPicPr>
-                    <pic:cNvPr id="0" name="" descr=""/>
-                    <pic:cNvPicPr>
-                      <a:picLocks noChangeAspect="1" noChangeArrowheads="1"/>
-                    </pic:cNvPicPr>
-                  </pic:nvPicPr>
-                  <pic:blipFill>
-                    <a:blip r:embed="rId9" cstate="none"/>
-                    <a:srcRect/>
-                    <a:stretch>
-                      <a:fillRect/>
-                    </a:stretch>
-                  </pic:blipFill>
-                  <pic:spPr bwMode="auto">
-                    <a:xfrm>
-                      <a:off x="0" y="0"/>
-                      <a:ext cx="5524500" cy="3219450"/>
-                    </a:xfrm>
-                    <a:prstGeom prst="rect">
-                      <a:avLst/>
-                    </a:prstGeom>
-                  </pic:spPr>
-                </pic:pic>
-              </a:graphicData>
-            </a:graphic>
-          </wp:inline>
-        </w:drawing>
       </w:r>
     </w:p>
     <w:p>
@@ -749,6 +704,45 @@
     </w:p>
     <w:p>
       <w:pPr>
+        <w:jc w:val="center"/>
+      </w:pPr>
+      <w:r>
+        <w:drawing>
+          <wp:inline xmlns:a="http://schemas.openxmlformats.org/drawingml/2006/main" xmlns:pic="http://schemas.openxmlformats.org/drawingml/2006/picture">
+            <wp:extent cx="5029200" cy="2933700"/>
+            <wp:docPr id="1" name="Picture 1"/>
+            <wp:cNvGraphicFramePr>
+              <a:graphicFrameLocks noChangeAspect="1"/>
+            </wp:cNvGraphicFramePr>
+            <a:graphic>
+              <a:graphicData uri="http://schemas.openxmlformats.org/drawingml/2006/picture">
+                <pic:pic>
+                  <pic:nvPicPr>
+                    <pic:cNvPr id="0" name="image.png"/>
+                    <pic:cNvPicPr/>
+                  </pic:nvPicPr>
+                  <pic:blipFill>
+                    <a:blip r:embed="rId9"/>
+                    <a:stretch>
+                      <a:fillRect/>
+                    </a:stretch>
+                  </pic:blipFill>
+                  <pic:spPr>
+                    <a:xfrm>
+                      <a:off x="0" y="0"/>
+                      <a:ext cx="5029200" cy="2933700"/>
+                    </a:xfrm>
+                    <a:prstGeom prst="rect"/>
+                  </pic:spPr>
+                </pic:pic>
+              </a:graphicData>
+            </a:graphic>
+          </wp:inline>
+        </w:drawing>
+      </w:r>
+    </w:p>
+    <w:p>
+      <w:pPr>
         <w:spacing w:after="100" w:before="60" w:line="276"/>
       </w:pPr>
       <w:r>
@@ -815,6 +809,45 @@
     </w:p>
     <w:p>
       <w:pPr>
+        <w:jc w:val="center"/>
+      </w:pPr>
+      <w:r>
+        <w:drawing>
+          <wp:inline xmlns:a="http://schemas.openxmlformats.org/drawingml/2006/main" xmlns:pic="http://schemas.openxmlformats.org/drawingml/2006/picture">
+            <wp:extent cx="5029200" cy="2933700"/>
+            <wp:docPr id="2" name="Picture 2"/>
+            <wp:cNvGraphicFramePr>
+              <a:graphicFrameLocks noChangeAspect="1"/>
+            </wp:cNvGraphicFramePr>
+            <a:graphic>
+              <a:graphicData uri="http://schemas.openxmlformats.org/drawingml/2006/picture">
+                <pic:pic>
+                  <pic:nvPicPr>
+                    <pic:cNvPr id="0" name="image.png"/>
+                    <pic:cNvPicPr/>
+                  </pic:nvPicPr>
+                  <pic:blipFill>
+                    <a:blip r:embed="rId9"/>
+                    <a:stretch>
+                      <a:fillRect/>
+                    </a:stretch>
+                  </pic:blipFill>
+                  <pic:spPr>
+                    <a:xfrm>
+                      <a:off x="0" y="0"/>
+                      <a:ext cx="5029200" cy="2933700"/>
+                    </a:xfrm>
+                    <a:prstGeom prst="rect"/>
+                  </pic:spPr>
+                </pic:pic>
+              </a:graphicData>
+            </a:graphic>
+          </wp:inline>
+        </w:drawing>
+      </w:r>
+    </w:p>
+    <w:p>
+      <w:pPr>
         <w:pStyle w:val="Heading1"/>
         <w:spacing w:after="120" w:before="360"/>
       </w:pPr>
@@ -891,6 +924,45 @@
           <w:szCs w:val="22"/>
         </w:rPr>
         <w:t xml:space="preserve"> that is suitable for sharing with stakeholders or retaining for compliance records.</w:t>
+      </w:r>
+    </w:p>
+    <w:p>
+      <w:pPr>
+        <w:jc w:val="center"/>
+      </w:pPr>
+      <w:r>
+        <w:drawing>
+          <wp:inline xmlns:a="http://schemas.openxmlformats.org/drawingml/2006/main" xmlns:pic="http://schemas.openxmlformats.org/drawingml/2006/picture">
+            <wp:extent cx="5029200" cy="2933700"/>
+            <wp:docPr id="3" name="Picture 3"/>
+            <wp:cNvGraphicFramePr>
+              <a:graphicFrameLocks noChangeAspect="1"/>
+            </wp:cNvGraphicFramePr>
+            <a:graphic>
+              <a:graphicData uri="http://schemas.openxmlformats.org/drawingml/2006/picture">
+                <pic:pic>
+                  <pic:nvPicPr>
+                    <pic:cNvPr id="0" name="image.png"/>
+                    <pic:cNvPicPr/>
+                  </pic:nvPicPr>
+                  <pic:blipFill>
+                    <a:blip r:embed="rId10"/>
+                    <a:stretch>
+                      <a:fillRect/>
+                    </a:stretch>
+                  </pic:blipFill>
+                  <pic:spPr>
+                    <a:xfrm>
+                      <a:off x="0" y="0"/>
+                      <a:ext cx="5029200" cy="2933700"/>
+                    </a:xfrm>
+                    <a:prstGeom prst="rect"/>
+                  </pic:spPr>
+                </pic:pic>
+              </a:graphicData>
+            </a:graphic>
+          </wp:inline>
+        </w:drawing>
       </w:r>
     </w:p>
     <w:p>
@@ -1359,41 +1431,35 @@
     </w:p>
     <w:p>
       <w:pPr>
-        <w:spacing w:after="120" w:before="80"/>
+        <w:jc w:val="center"/>
       </w:pPr>
       <w:r>
         <w:drawing>
-          <wp:inline distT="0" distB="0" distL="0" distR="0">
-            <wp:extent cx="5715000" cy="3333750"/>
-            <wp:effectExtent t="0" r="0" b="0" l="0"/>
-            <wp:docPr id="1" name="" descr="" title=""/>
+          <wp:inline xmlns:a="http://schemas.openxmlformats.org/drawingml/2006/main" xmlns:pic="http://schemas.openxmlformats.org/drawingml/2006/picture">
+            <wp:extent cx="5029200" cy="3069908"/>
+            <wp:docPr id="4" name="Picture 4"/>
             <wp:cNvGraphicFramePr>
-              <a:graphicFrameLocks xmlns:a="http://schemas.openxmlformats.org/drawingml/2006/main" noChangeAspect="1"/>
+              <a:graphicFrameLocks noChangeAspect="1"/>
             </wp:cNvGraphicFramePr>
-            <a:graphic xmlns:a="http://schemas.openxmlformats.org/drawingml/2006/main">
+            <a:graphic>
               <a:graphicData uri="http://schemas.openxmlformats.org/drawingml/2006/picture">
-                <pic:pic xmlns:pic="http://schemas.openxmlformats.org/drawingml/2006/picture">
+                <pic:pic>
                   <pic:nvPicPr>
-                    <pic:cNvPr id="0" name="" descr=""/>
-                    <pic:cNvPicPr>
-                      <a:picLocks noChangeAspect="1" noChangeArrowheads="1"/>
-                    </pic:cNvPicPr>
+                    <pic:cNvPr id="0" name="image.png"/>
+                    <pic:cNvPicPr/>
                   </pic:nvPicPr>
                   <pic:blipFill>
-                    <a:blip r:embed="rId11" cstate="none"/>
-                    <a:srcRect/>
+                    <a:blip r:embed="rId11"/>
                     <a:stretch>
                       <a:fillRect/>
                     </a:stretch>
                   </pic:blipFill>
-                  <pic:spPr bwMode="auto">
+                  <pic:spPr>
                     <a:xfrm>
                       <a:off x="0" y="0"/>
-                      <a:ext cx="5715000" cy="3333750"/>
+                      <a:ext cx="5029200" cy="3069908"/>
                     </a:xfrm>
-                    <a:prstGeom prst="rect">
-                      <a:avLst/>
-                    </a:prstGeom>
+                    <a:prstGeom prst="rect"/>
                   </pic:spPr>
                 </pic:pic>
               </a:graphicData>
@@ -1412,10 +1478,88 @@
     </w:p>
     <w:p>
       <w:pPr>
+        <w:jc w:val="center"/>
+      </w:pPr>
+      <w:r>
+        <w:drawing>
+          <wp:inline xmlns:a="http://schemas.openxmlformats.org/drawingml/2006/main" xmlns:pic="http://schemas.openxmlformats.org/drawingml/2006/picture">
+            <wp:extent cx="5029200" cy="3509962"/>
+            <wp:docPr id="5" name="Picture 5"/>
+            <wp:cNvGraphicFramePr>
+              <a:graphicFrameLocks noChangeAspect="1"/>
+            </wp:cNvGraphicFramePr>
+            <a:graphic>
+              <a:graphicData uri="http://schemas.openxmlformats.org/drawingml/2006/picture">
+                <pic:pic>
+                  <pic:nvPicPr>
+                    <pic:cNvPr id="0" name="image.png"/>
+                    <pic:cNvPicPr/>
+                  </pic:nvPicPr>
+                  <pic:blipFill>
+                    <a:blip r:embed="rId12"/>
+                    <a:stretch>
+                      <a:fillRect/>
+                    </a:stretch>
+                  </pic:blipFill>
+                  <pic:spPr>
+                    <a:xfrm>
+                      <a:off x="0" y="0"/>
+                      <a:ext cx="5029200" cy="3509962"/>
+                    </a:xfrm>
+                    <a:prstGeom prst="rect"/>
+                  </pic:spPr>
+                </pic:pic>
+              </a:graphicData>
+            </a:graphic>
+          </wp:inline>
+        </w:drawing>
+      </w:r>
+    </w:p>
+    <w:p>
+      <w:pPr>
         <w:spacing w:after="100" w:before="60" w:line="276"/>
       </w:pPr>
       <w:r>
         <w:t xml:space="preserve">Step 8: Click Export to Excel to download the results.</w:t>
+      </w:r>
+    </w:p>
+    <w:p>
+      <w:pPr>
+        <w:jc w:val="center"/>
+      </w:pPr>
+      <w:r>
+        <w:drawing>
+          <wp:inline xmlns:a="http://schemas.openxmlformats.org/drawingml/2006/main" xmlns:pic="http://schemas.openxmlformats.org/drawingml/2006/picture">
+            <wp:extent cx="5029200" cy="3557111"/>
+            <wp:docPr id="6" name="Picture 6"/>
+            <wp:cNvGraphicFramePr>
+              <a:graphicFrameLocks noChangeAspect="1"/>
+            </wp:cNvGraphicFramePr>
+            <a:graphic>
+              <a:graphicData uri="http://schemas.openxmlformats.org/drawingml/2006/picture">
+                <pic:pic>
+                  <pic:nvPicPr>
+                    <pic:cNvPr id="0" name="04b_report_export.png"/>
+                    <pic:cNvPicPr/>
+                  </pic:nvPicPr>
+                  <pic:blipFill>
+                    <a:blip r:embed="rId19"/>
+                    <a:stretch>
+                      <a:fillRect/>
+                    </a:stretch>
+                  </pic:blipFill>
+                  <pic:spPr>
+                    <a:xfrm>
+                      <a:off x="0" y="0"/>
+                      <a:ext cx="5029200" cy="3557111"/>
+                    </a:xfrm>
+                    <a:prstGeom prst="rect"/>
+                  </pic:spPr>
+                </pic:pic>
+              </a:graphicData>
+            </a:graphic>
+          </wp:inline>
+        </w:drawing>
       </w:r>
     </w:p>
     <w:p>
@@ -1639,6 +1783,45 @@
     </w:p>
     <w:p>
       <w:pPr>
+        <w:jc w:val="center"/>
+      </w:pPr>
+      <w:r>
+        <w:drawing>
+          <wp:inline xmlns:a="http://schemas.openxmlformats.org/drawingml/2006/main" xmlns:pic="http://schemas.openxmlformats.org/drawingml/2006/picture">
+            <wp:extent cx="5029200" cy="3420904"/>
+            <wp:docPr id="7" name="Picture 7"/>
+            <wp:cNvGraphicFramePr>
+              <a:graphicFrameLocks noChangeAspect="1"/>
+            </wp:cNvGraphicFramePr>
+            <a:graphic>
+              <a:graphicData uri="http://schemas.openxmlformats.org/drawingml/2006/picture">
+                <pic:pic>
+                  <pic:nvPicPr>
+                    <pic:cNvPr id="0" name="image.png"/>
+                    <pic:cNvPicPr/>
+                  </pic:nvPicPr>
+                  <pic:blipFill>
+                    <a:blip r:embed="rId13"/>
+                    <a:stretch>
+                      <a:fillRect/>
+                    </a:stretch>
+                  </pic:blipFill>
+                  <pic:spPr>
+                    <a:xfrm>
+                      <a:off x="0" y="0"/>
+                      <a:ext cx="5029200" cy="3420904"/>
+                    </a:xfrm>
+                    <a:prstGeom prst="rect"/>
+                  </pic:spPr>
+                </pic:pic>
+              </a:graphicData>
+            </a:graphic>
+          </wp:inline>
+        </w:drawing>
+      </w:r>
+    </w:p>
+    <w:p>
+      <w:pPr>
         <w:pStyle w:val="Heading2"/>
         <w:spacing w:after="80" w:before="240"/>
       </w:pPr>
@@ -2195,6 +2378,45 @@
     </w:p>
     <w:p>
       <w:pPr>
+        <w:jc w:val="center"/>
+      </w:pPr>
+      <w:r>
+        <w:drawing>
+          <wp:inline xmlns:a="http://schemas.openxmlformats.org/drawingml/2006/main" xmlns:pic="http://schemas.openxmlformats.org/drawingml/2006/picture">
+            <wp:extent cx="5029200" cy="2933700"/>
+            <wp:docPr id="8" name="Picture 8"/>
+            <wp:cNvGraphicFramePr>
+              <a:graphicFrameLocks noChangeAspect="1"/>
+            </wp:cNvGraphicFramePr>
+            <a:graphic>
+              <a:graphicData uri="http://schemas.openxmlformats.org/drawingml/2006/picture">
+                <pic:pic>
+                  <pic:nvPicPr>
+                    <pic:cNvPr id="0" name="image.png"/>
+                    <pic:cNvPicPr/>
+                  </pic:nvPicPr>
+                  <pic:blipFill>
+                    <a:blip r:embed="rId14"/>
+                    <a:stretch>
+                      <a:fillRect/>
+                    </a:stretch>
+                  </pic:blipFill>
+                  <pic:spPr>
+                    <a:xfrm>
+                      <a:off x="0" y="0"/>
+                      <a:ext cx="5029200" cy="2933700"/>
+                    </a:xfrm>
+                    <a:prstGeom prst="rect"/>
+                  </pic:spPr>
+                </pic:pic>
+              </a:graphicData>
+            </a:graphic>
+          </wp:inline>
+        </w:drawing>
+      </w:r>
+    </w:p>
+    <w:p>
+      <w:pPr>
         <w:pStyle w:val="Heading2"/>
         <w:spacing w:after="80" w:before="240"/>
       </w:pPr>
@@ -2352,6 +2574,45 @@
           <w:szCs w:val="22"/>
         </w:rPr>
         <w:t xml:space="preserve">The scan begins automatically. A progress bar, elapsed timer, and status message show the scan's progress.</w:t>
+      </w:r>
+    </w:p>
+    <w:p>
+      <w:pPr>
+        <w:jc w:val="center"/>
+      </w:pPr>
+      <w:r>
+        <w:drawing>
+          <wp:inline xmlns:a="http://schemas.openxmlformats.org/drawingml/2006/main" xmlns:pic="http://schemas.openxmlformats.org/drawingml/2006/picture">
+            <wp:extent cx="5029200" cy="2933700"/>
+            <wp:docPr id="9" name="Picture 9"/>
+            <wp:cNvGraphicFramePr>
+              <a:graphicFrameLocks noChangeAspect="1"/>
+            </wp:cNvGraphicFramePr>
+            <a:graphic>
+              <a:graphicData uri="http://schemas.openxmlformats.org/drawingml/2006/picture">
+                <pic:pic>
+                  <pic:nvPicPr>
+                    <pic:cNvPr id="0" name="image.png"/>
+                    <pic:cNvPicPr/>
+                  </pic:nvPicPr>
+                  <pic:blipFill>
+                    <a:blip r:embed="rId15"/>
+                    <a:stretch>
+                      <a:fillRect/>
+                    </a:stretch>
+                  </pic:blipFill>
+                  <pic:spPr>
+                    <a:xfrm>
+                      <a:off x="0" y="0"/>
+                      <a:ext cx="5029200" cy="2933700"/>
+                    </a:xfrm>
+                    <a:prstGeom prst="rect"/>
+                  </pic:spPr>
+                </pic:pic>
+              </a:graphicData>
+            </a:graphic>
+          </wp:inline>
+        </w:drawing>
       </w:r>
     </w:p>
     <w:p>
@@ -2842,6 +3103,45 @@
     </w:p>
     <w:p>
       <w:pPr>
+        <w:jc w:val="center"/>
+      </w:pPr>
+      <w:r>
+        <w:drawing>
+          <wp:inline xmlns:a="http://schemas.openxmlformats.org/drawingml/2006/main" xmlns:pic="http://schemas.openxmlformats.org/drawingml/2006/picture">
+            <wp:extent cx="5029200" cy="2933700"/>
+            <wp:docPr id="10" name="Picture 10"/>
+            <wp:cNvGraphicFramePr>
+              <a:graphicFrameLocks noChangeAspect="1"/>
+            </wp:cNvGraphicFramePr>
+            <a:graphic>
+              <a:graphicData uri="http://schemas.openxmlformats.org/drawingml/2006/picture">
+                <pic:pic>
+                  <pic:nvPicPr>
+                    <pic:cNvPr id="0" name="image.png"/>
+                    <pic:cNvPicPr/>
+                  </pic:nvPicPr>
+                  <pic:blipFill>
+                    <a:blip r:embed="rId16"/>
+                    <a:stretch>
+                      <a:fillRect/>
+                    </a:stretch>
+                  </pic:blipFill>
+                  <pic:spPr>
+                    <a:xfrm>
+                      <a:off x="0" y="0"/>
+                      <a:ext cx="5029200" cy="2933700"/>
+                    </a:xfrm>
+                    <a:prstGeom prst="rect"/>
+                  </pic:spPr>
+                </pic:pic>
+              </a:graphicData>
+            </a:graphic>
+          </wp:inline>
+        </w:drawing>
+      </w:r>
+    </w:p>
+    <w:p>
+      <w:pPr>
         <w:pStyle w:val="Heading1"/>
         <w:spacing w:after="120" w:before="360"/>
       </w:pPr>
@@ -2855,6 +3155,45 @@
       </w:pPr>
       <w:r>
         <w:t xml:space="preserve">The Settings page is accessible from the gear icon (⚙) in the top-right corner of the banner on every screen, including the home screen. Clicking the gear opens a dedicated full-page settings view with a Back button to return to where you were.</w:t>
+      </w:r>
+    </w:p>
+    <w:p>
+      <w:pPr>
+        <w:jc w:val="center"/>
+      </w:pPr>
+      <w:r>
+        <w:drawing>
+          <wp:inline xmlns:a="http://schemas.openxmlformats.org/drawingml/2006/main" xmlns:pic="http://schemas.openxmlformats.org/drawingml/2006/picture">
+            <wp:extent cx="5029200" cy="2933700"/>
+            <wp:docPr id="11" name="Picture 11"/>
+            <wp:cNvGraphicFramePr>
+              <a:graphicFrameLocks noChangeAspect="1"/>
+            </wp:cNvGraphicFramePr>
+            <a:graphic>
+              <a:graphicData uri="http://schemas.openxmlformats.org/drawingml/2006/picture">
+                <pic:pic>
+                  <pic:nvPicPr>
+                    <pic:cNvPr id="0" name="image.png"/>
+                    <pic:cNvPicPr/>
+                  </pic:nvPicPr>
+                  <pic:blipFill>
+                    <a:blip r:embed="rId17"/>
+                    <a:stretch>
+                      <a:fillRect/>
+                    </a:stretch>
+                  </pic:blipFill>
+                  <pic:spPr>
+                    <a:xfrm>
+                      <a:off x="0" y="0"/>
+                      <a:ext cx="5029200" cy="2933700"/>
+                    </a:xfrm>
+                    <a:prstGeom prst="rect"/>
+                  </pic:spPr>
+                </pic:pic>
+              </a:graphicData>
+            </a:graphic>
+          </wp:inline>
+        </w:drawing>
       </w:r>
     </w:p>
     <w:p>

</xml_diff>